<commit_message>
Add Figure 4A, 4B references and fix Figure citation order
- Added Figure 4A and 4B descriptions to Discussion section
  (previously only Figure 4C was mentioned)
- Added Figure 1 reference to Results (Data Acquisition section)
- Added Figures 2 and 3 references to Training and Race results
- Fixed citation order to satisfy MSSE requirement:
  Figure 1 → Figures 2 and 3 → Figure 4

https://claude.ai/code/session_01J2a1QLrR7Ny8QgoVtCKTCY
</commit_message>
<xml_diff>
--- a/manuscript_MSSE.docx
+++ b/manuscript_MSSE.docx
@@ -990,10 +990,7 @@
         <w:jc w:val="both"/>
       </w:pPr>
       <w:r>
-        <w:rPr>
-          <w:rFonts w:eastAsia="Times New Roman"/>
-        </w:rPr>
-        <w:t>Complete CGM and performance data were obtained from 57 participants across 329 exercise events: 203 race-pace training sessions and 126 competitive races. The training success rate (86.2%) significantly exceeded the competitive success rate (65.9%; χ² = 17.81, p &lt; 0.001), confirming the practice-to-competition performance gap in this cohort (Table 1).</w:t>
+        <w:t>Complete CGM and performance data were obtained from 57 participants across 329 exercise events: 203 race-pace training sessions and 126 competitive races. Representative 24-h glucose traces illustrating the contrast between competition and training days are shown in Figure 1. The training success rate (86.2%) significantly exceeded the competitive success rate (65.9%; χ² = 17.81, p &lt; 0.001), confirming the practice-to-competition performance gap in this cohort (Table 1).</w:t>
       </w:r>
     </w:p>
     <w:p>
@@ -1027,10 +1024,7 @@
         <w:jc w:val="both"/>
       </w:pPr>
       <w:r>
-        <w:rPr>
-          <w:rFonts w:eastAsia="Times New Roman"/>
-        </w:rPr>
-        <w:t>During training sessions, athletes who achieved their performance goals demonstrated significantly lower glucose levels across all four measured parameters compared to unsuccessful performers (Table 2). The difference was largest for during-exercise maximum glucose (successful: 138.0 ± 26.0 mg/dL vs. unsuccessful: 173.1 ± 45.9 mg/dL; d = −0.94), with a large effect size also observed for during-exercise average glucose (125.0 ± 24.5 vs. 145.0 ± 36.8 mg/dL; p &lt; 0.001; d = −0.64). Pre-exercise glucose in the 2 h preceding training was modestly but significantly lower in successful performers for both average (111.0 ± 15.9 vs. 119.1 ± 20.1 mg/dL; p = 0.008; d = −0.50) and maximum (128.8 ± 19.5 vs. 140.7 ± 27.1 mg/dL; p = 0.002; d = −0.55) values.</w:t>
+        <w:t>During training sessions, athletes who achieved their performance goals demonstrated significantly lower glucose levels across all four measured parameters compared to unsuccessful performers (Table 2; Figures 2 and 3, panels A and C). The difference was largest for during-exercise maximum glucose (successful: 138.0 ± 26.0 mg/dL vs. unsuccessful: 173.1 ± 45.9 mg/dL; d = −0.94), with a large effect size also observed for during-exercise average glucose (125.0 ± 24.5 vs. 145.0 ± 36.8 mg/dL; p &lt; 0.001; d = −0.64). Pre-exercise glucose in the 2 h preceding training was modestly but significantly lower in successful performers for both average (111.0 ± 15.9 vs. 119.1 ± 20.1 mg/dL; p = 0.008; d = −0.50) and maximum (128.8 ± 19.5 vs. 140.7 ± 27.1 mg/dL; p = 0.002; d = −0.55) values.</w:t>
       </w:r>
     </w:p>
     <w:p>
@@ -1064,17 +1058,7 @@
         <w:jc w:val="both"/>
       </w:pPr>
       <w:r>
-        <w:rPr>
-          <w:rFonts w:eastAsia="Times New Roman"/>
-        </w:rPr>
-        <w:t xml:space="preserve">The pattern observed during competition was paradoxically opposite to that seen in training (Table 3). Successful race performers showed markedly higher glucose levels than unsuccessful performers across all parameters. The most striking difference was in during-exercise average glucose (206.4 ± 34.5 vs. 166.9 ± 33.2 mg/dL; p &lt; 0.001; d = 1.17) and during-exercise maximum </w:t>
-      </w:r>
-      <w:r>
-        <w:rPr>
-          <w:rFonts w:eastAsia="Times New Roman"/>
-        </w:rPr>
-        <w:lastRenderedPageBreak/>
-        <w:t>glucose (241.1 ± 43.3 vs. 195.5 ± 38.5 mg/dL; p &lt; 0.001; d = 1.11), both representing very large effect sizes. Pre-exercise average glucose was also significantly higher in successful race performers beginning from the 2-h pre-race window (148.7 ± 18.5 vs. 136.1 ± 20.0 mg/dL; p &lt; 0.001; d = 0.65).</w:t>
+        <w:t>The pattern observed during competition was paradoxically opposite to that seen in training (Table 3; Figures 2 and 3, panels B and D). Successful race performers showed markedly higher glucose levels than unsuccessful performers across all parameters. The most striking difference was in during-exercise average glucose (206.4 ± 34.5 vs. 166.9 ± 33.2 mg/dL; p &lt; 0.001; d = 1.17) and during-exercise maximum glucose (241.1 ± 43.3 vs. 195.5 ± 38.5 mg/dL; p &lt; 0.001; d = 1.11), both representing very large effect sizes. Pre-exercise average glucose was also significantly higher in successful race performers beginning from the 2-h pre-race window (148.7 ± 18.5 vs. 136.1 ± 20.0 mg/dL; p &lt; 0.001; d = 0.65).</w:t>
       </w:r>
     </w:p>
     <w:p>
@@ -1331,17 +1315,7 @@
         <w:jc w:val="both"/>
       </w:pPr>
       <w:r>
-        <w:rPr>
-          <w:color w:val="000000" w:themeColor="text1"/>
-          <w:sz w:val="22"/>
-        </w:rPr>
-        <w:t xml:space="preserve">The pacemaker observation (Figure 4C) provides illustrative support for this interpretation. A male collegiate runner serving as a pacemaker in a women's elite marathon — running at a predetermined pace without personal performance objectives — exhibited substantially lower glucose levels (average ~111 mg/dL) than competitive runners pursuing personal goals. In the absence of competitive psychological pressure, the stress-driven glucose mobilization response was markedly attenuated, despite equivalent physical demands. </w:t>
-      </w:r>
-      <w:r>
-        <w:rPr>
-          <w:sz w:val="22"/>
-        </w:rPr>
-        <w:t>This dissociation of exercise intensity from glucose elevation reinforces the central role of psychological stress, rather than metabolic demand alone, in competition-induced glucose dynamics.</w:t>
+        <w:t>Figure 4 illustrates individual glucose profiles during competitive marathon racing. Figure 4A shows a male competitive marathon runner (finish time 2:10:45) who maintained stable glucose averaging 168.1 mg/dL with consistent pacing throughout the race. Figure 4B depicts another male competitive runner (finish time 2:11:23) who demonstrated progressive glucose elevation reaching a peak of 275 mg/dL while sustaining his target pace. In contrast, the pacemaker observation (Figure 4C) provides illustrative support for the role of psychological stress. A male collegiate runner serving as a pacemaker in a women's elite marathon — running at a predetermined pace without personal performance objectives — exhibited substantially lower glucose levels (average ~111 mg/dL) than the competitive runners shown in Figures 4A and 4B. In the absence of competitive psychological pressure, the stress-driven glucose mobilization response was markedly attenuated, despite equivalent physical demands. This dissociation of exercise intensity from glucose elevation reinforces the central role of psychological stress, rather than metabolic demand alone, in competition-induced glucose dynamics.</w:t>
       </w:r>
     </w:p>
     <w:p>

</xml_diff>